<commit_message>
Corrected some info in Design Document.
</commit_message>
<xml_diff>
--- a/app/docs/Design Document.docx
+++ b/app/docs/Design Document.docx
@@ -2224,14 +2224,7 @@
         <w:rPr>
           <w:rFonts w:ascii="Times New Roman" w:hAnsi="Times New Roman" w:cs="Times New Roman"/>
         </w:rPr>
-        <w:t xml:space="preserve">User interactions in the UI trigger actions in </w:t>
-      </w:r>
-      <w:proofErr w:type="gramStart"/>
-      <w:r>
-        <w:rPr>
-          <w:rFonts w:ascii="Times New Roman" w:hAnsi="Times New Roman" w:cs="Times New Roman"/>
-        </w:rPr>
-        <w:t xml:space="preserve">the </w:t>
+        <w:t xml:space="preserve">User interactions in the UI trigger actions in the </w:t>
       </w:r>
       <w:proofErr w:type="spellStart"/>
       <w:r>
@@ -2241,7 +2234,6 @@
         <w:t>ViewModels</w:t>
       </w:r>
       <w:proofErr w:type="spellEnd"/>
-      <w:proofErr w:type="gramEnd"/>
     </w:p>
     <w:p>
       <w:pPr>
@@ -2570,21 +2562,7 @@
         <w:rPr>
           <w:rFonts w:ascii="Times New Roman" w:hAnsi="Times New Roman" w:cs="Times New Roman"/>
         </w:rPr>
-        <w:t xml:space="preserve">: Primary container for the </w:t>
-      </w:r>
-      <w:proofErr w:type="gramStart"/>
-      <w:r>
-        <w:rPr>
-          <w:rFonts w:ascii="Times New Roman" w:hAnsi="Times New Roman" w:cs="Times New Roman"/>
-        </w:rPr>
-        <w:t>four quadrant</w:t>
-      </w:r>
-      <w:proofErr w:type="gramEnd"/>
-      <w:r>
-        <w:rPr>
-          <w:rFonts w:ascii="Times New Roman" w:hAnsi="Times New Roman" w:cs="Times New Roman"/>
-        </w:rPr>
-        <w:t xml:space="preserve"> layout</w:t>
+        <w:t>: Primary container for the four quadrant layout</w:t>
       </w:r>
     </w:p>
     <w:p>
@@ -2993,21 +2971,7 @@
         <w:rPr>
           <w:rFonts w:ascii="Times New Roman" w:hAnsi="Times New Roman" w:cs="Times New Roman"/>
         </w:rPr>
-        <w:t xml:space="preserve">: Shop </w:t>
-      </w:r>
-      <w:proofErr w:type="gramStart"/>
-      <w:r>
-        <w:rPr>
-          <w:rFonts w:ascii="Times New Roman" w:hAnsi="Times New Roman" w:cs="Times New Roman"/>
-        </w:rPr>
-        <w:t>entity</w:t>
-      </w:r>
-      <w:proofErr w:type="gramEnd"/>
-      <w:r>
-        <w:rPr>
-          <w:rFonts w:ascii="Times New Roman" w:hAnsi="Times New Roman" w:cs="Times New Roman"/>
-        </w:rPr>
-        <w:t xml:space="preserve"> database operations</w:t>
+        <w:t>: Shop entity database operations</w:t>
       </w:r>
     </w:p>
     <w:p>
@@ -3116,21 +3080,7 @@
         <w:rPr>
           <w:rFonts w:ascii="Times New Roman" w:hAnsi="Times New Roman" w:cs="Times New Roman"/>
         </w:rPr>
-        <w:t xml:space="preserve"> </w:t>
-      </w:r>
-      <w:proofErr w:type="gramStart"/>
-      <w:r>
-        <w:rPr>
-          <w:rFonts w:ascii="Times New Roman" w:hAnsi="Times New Roman" w:cs="Times New Roman"/>
-        </w:rPr>
-        <w:t>entity</w:t>
-      </w:r>
-      <w:proofErr w:type="gramEnd"/>
-      <w:r>
-        <w:rPr>
-          <w:rFonts w:ascii="Times New Roman" w:hAnsi="Times New Roman" w:cs="Times New Roman"/>
-        </w:rPr>
-        <w:t xml:space="preserve"> database operations</w:t>
+        <w:t xml:space="preserve"> entity database operations</w:t>
       </w:r>
     </w:p>
     <w:p>
@@ -3520,21 +3470,7 @@
         <w:rPr>
           <w:rFonts w:ascii="Times New Roman" w:hAnsi="Times New Roman" w:cs="Times New Roman"/>
         </w:rPr>
-        <w:t xml:space="preserve">The user interface is divided into four </w:t>
-      </w:r>
-      <w:proofErr w:type="gramStart"/>
-      <w:r>
-        <w:rPr>
-          <w:rFonts w:ascii="Times New Roman" w:hAnsi="Times New Roman" w:cs="Times New Roman"/>
-        </w:rPr>
-        <w:t>quadrants,</w:t>
-      </w:r>
-      <w:proofErr w:type="gramEnd"/>
-      <w:r>
-        <w:rPr>
-          <w:rFonts w:ascii="Times New Roman" w:hAnsi="Times New Roman" w:cs="Times New Roman"/>
-        </w:rPr>
-        <w:t xml:space="preserve"> each focused on a specific aspect of personnel and event management:</w:t>
+        <w:t>The user interface is divided into four quadrants, each focused on a specific aspect of personnel and event management:</w:t>
       </w:r>
     </w:p>
     <w:p>
@@ -3704,7 +3640,19 @@
         <w:rPr>
           <w:rFonts w:ascii="Times New Roman" w:hAnsi="Times New Roman" w:cs="Times New Roman"/>
         </w:rPr>
-        <w:t>Minimized text input in favor of selection and drag-and-drop operations</w:t>
+        <w:t>Minimized text input in favor of selection and d</w:t>
+      </w:r>
+      <w:r>
+        <w:rPr>
+          <w:rFonts w:ascii="Times New Roman" w:hAnsi="Times New Roman" w:cs="Times New Roman"/>
+        </w:rPr>
+        <w:t xml:space="preserve">ropdown </w:t>
+      </w:r>
+      <w:r>
+        <w:rPr>
+          <w:rFonts w:ascii="Times New Roman" w:hAnsi="Times New Roman" w:cs="Times New Roman"/>
+        </w:rPr>
+        <w:t>operations</w:t>
       </w:r>
     </w:p>
     <w:p>
@@ -4044,21 +3992,7 @@
         <w:rPr>
           <w:rFonts w:ascii="Times New Roman" w:hAnsi="Times New Roman" w:cs="Times New Roman"/>
         </w:rPr>
-        <w:t xml:space="preserve">The Personnel &amp; Events Dashboard is designed with </w:t>
-      </w:r>
-      <w:proofErr w:type="gramStart"/>
-      <w:r>
-        <w:rPr>
-          <w:rFonts w:ascii="Times New Roman" w:hAnsi="Times New Roman" w:cs="Times New Roman"/>
-        </w:rPr>
-        <w:t>a clean</w:t>
-      </w:r>
-      <w:proofErr w:type="gramEnd"/>
-      <w:r>
-        <w:rPr>
-          <w:rFonts w:ascii="Times New Roman" w:hAnsi="Times New Roman" w:cs="Times New Roman"/>
-        </w:rPr>
-        <w:t>, layered architecture that separates concerns and enables maintainability. The MVVM pattern ensures that UI components remain decoupled from the business logic, while the Repository pattern provides a clean abstraction over the data sources.</w:t>
+        <w:t>The Personnel &amp; Events Dashboard is designed with a clean, layered architecture that separates concerns and enables maintainability. The MVVM pattern ensures that UI components remain decoupled from the business logic, while the Repository pattern provides a clean abstraction over the data sources.</w:t>
       </w:r>
     </w:p>
     <w:p>

</xml_diff>